<commit_message>
docs: explain project design choices and development in the report
</commit_message>
<xml_diff>
--- a/submission/NarraCare_Final_Report.docx
+++ b/submission/NarraCare_Final_Report.docx
@@ -11,7 +11,7 @@
           <w:rFonts w:ascii="Arial" w:hAnsi="Arial"/>
           <w:sz w:val="22"/>
         </w:rPr>
-        <w:t>NarraCare: An Inspectable Conversational Rehabilitation Recommender</w:t>
+        <w:t>NarraCare: A Conversational Rehabilitation Recommender with a Narrative Companion</w:t>
       </w:r>
     </w:p>
     <w:p>
@@ -47,7 +47,7 @@
           <w:rFonts w:ascii="Arial" w:hAnsi="Arial"/>
           <w:sz w:val="22"/>
         </w:rPr>
-        <w:t>1.1 Motivation and practical value</w:t>
+        <w:t>1.1 The problem we chose</w:t>
       </w:r>
     </w:p>
     <w:p>
@@ -56,7 +56,7 @@
           <w:rFonts w:ascii="Arial" w:hAnsi="Arial"/>
           <w:sz w:val="22"/>
         </w:rPr>
-        <w:t>Home rehabilitation requires repeated choices about what to attempt, how much effort is manageable, and when to rest. Adherence barriers include pain, low confidence and limited support [1,2]. Our target is a bounded recommendation prototype for postoperative ACL/rotator-cuff rehabilitation and chronic lower-back pain. It is not a diagnosis, treatment planner or clinically validated service.</w:t>
+        <w:t>Home rehabilitation involves a small but repeated decision: what is a manageable exercise for me today? Pain, fatigue and confidence can change from day to day, while limited support can make a programme difficult to sustain [1,2]. We chose this setting because it brings together personalization, sequential feedback and constraints that a general item-ranking system would not normally address.</w:t>
       </w:r>
     </w:p>
     <w:p>
@@ -65,7 +65,7 @@
           <w:rFonts w:ascii="Arial" w:hAnsi="Arial"/>
           <w:sz w:val="22"/>
         </w:rPr>
-        <w:t>The recommendation output is one named catalogue task with category, difficulty, a grounded selection explanation and a companion message. The practical engineering question is how to combine context-sensitive learning with independently enforced feasibility checks and observable feedback, rather than allowing an attractive narrative or a high reward to stand in for safety.</w:t>
+        <w:t>We built NarraCare for simulated users recovering from ACL or rotator-cuff surgery and users with chronic lower-back pain. Given a profile, current symptoms and preferences, it recommends one catalogue task with its name, category, difficulty and a short explanation. The user can revise the request, attempt the task or decline it. Reported outcomes then inform later recommendations.</w:t>
       </w:r>
     </w:p>
     <w:p>
@@ -74,7 +74,7 @@
           <w:rFonts w:ascii="Arial" w:hAnsi="Arial"/>
           <w:sz w:val="22"/>
         </w:rPr>
-        <w:t>A system of this form could inform a future clinician-reviewed home-exercise support tool: approved exercises would be retrieved for a confirmed profile, daily self-reports would constrain selection, and explicit outcomes would update preferences and task estimates. This project demonstrates that organization using synthetic data; it does not establish that these tasks are suitable for real patients.</w:t>
+        <w:t>Our aim was to combine useful task selection with a less impersonal interaction. We wanted progress to feel like taking a manageable step with a companion, rather than receiving another demanding exercise instruction. A future clinician-reviewed version could support daily choices within an approved rehabilitation programme. Our implementation explores that idea with synthetic data; it is not a clinical treatment service.</w:t>
       </w:r>
     </w:p>
     <w:p>
@@ -86,7 +86,7 @@
           <w:rFonts w:ascii="Arial" w:hAnsi="Arial"/>
           <w:sz w:val="22"/>
         </w:rPr>
-        <w:t>1.2 Task and contributions</w:t>
+        <w:t>1.2 What we designed and implemented</w:t>
       </w:r>
     </w:p>
     <w:p>
@@ -95,7 +95,7 @@
           <w:rFonts w:ascii="Arial" w:hAnsi="Arial"/>
           <w:sz w:val="22"/>
         </w:rPr>
-        <w:t>We formulate a 60-day, context-aware sequential recommendation task and provide an interactive LLM tool-using agent over the same ranking, safety and narration components. Its contributions are task-specific integration and inspectability, not a claim that a new algorithm dominates established methods.</w:t>
+        <w:t>We developed a 60-day recommendation pipeline with five components: User Simulator, Recommender, Safety Agent, Narrator and Reward Composer. We then extended it with a conversational agent so that a person could provide a check-in, express preferences and report feedback instead of only watching a simulated trajectory.</w:t>
       </w:r>
     </w:p>
     <w:p>
@@ -104,7 +104,7 @@
           <w:rFonts w:ascii="Arial" w:hAnsi="Arial"/>
           <w:sz w:val="22"/>
         </w:rPr>
-        <w:t>First, independent runtime predicates constrain delivery while a sampled safety-outcome bonus influences ranking. Second, proposal-layer IER and executed-task SVR expose different failure points, alongside reward, acceptance and completion. We report these complementary diagnostics without claiming to have invented a universal safety metric. Third, a source-fingerprinted evaluation runner links current code to all final reported experiments.</w:t>
+        <w:t>Our technical adaptation, SAPS, adds a sampled safety-outcome term to a LinUCB reward backbone. We keep that ranking decision separate from hard feasibility checks, and evaluate both delivered tasks and proposals that the checks would reject. This separation lets us investigate whether a better-looking safety metric comes from the learner or from the filter.</w:t>
       </w:r>
     </w:p>
     <w:p>
@@ -113,7 +113,7 @@
           <w:rFonts w:ascii="Arial" w:hAnsi="Arial"/>
           <w:sz w:val="22"/>
         </w:rPr>
-        <w:t>The application design combines a three-act mountain trail with a companion who scouts, walks alongside and gradually steps back. Small completed steps create progress; skips create camp without fabricated recovery. This is intended to provide achievable goals and companionship rather than constant coaching pressure. Its effect on adherence or fatigue remains a design hypothesis, not an evaluated benefit.</w:t>
+        <w:t>Our application design turns the programme into a three-act mountain trail. The companion first scouts ahead, then walks beside the user and eventually steps back as the story moves toward autonomy. Completed tasks create small achievements; skips create camp. This gives the recommendation a setting and a sense of company without making every interaction a performance challenge. Whether that experience improves adherence requires a user study.</w:t>
       </w:r>
     </w:p>
     <w:p>
@@ -125,7 +125,7 @@
           <w:rFonts w:ascii="Arial" w:hAnsi="Arial"/>
           <w:sz w:val="22"/>
         </w:rPr>
-        <w:t>1.3 Evidence scope</w:t>
+        <w:t>1.3 Evaluation overview</w:t>
       </w:r>
     </w:p>
     <w:p>
@@ -134,7 +134,7 @@
           <w:rFonts w:ascii="Arial" w:hAnsi="Arial"/>
           <w:sz w:val="22"/>
         </w:rPr>
-        <w:t>Final evaluation uses seven policies, 20 synthetic personas, 60 days and ten seed runs. SAPS does not significantly outperform LinUCB in reward, and Random scores higher. We therefore distinguish demonstrated integration and rule enforcement from unproven algorithmic superiority, clinical safety and narrative effectiveness.</w:t>
+        <w:t>We compare seven policies on 20 synthetic personas over 60 days and ten final seed runs. We also investigate shortlist size, task coverage, the sampled bonus and runtime filtering. The results support the value of separating these mechanisms, but do not show SAPS outperforming LinUCB or filtered Random on simulated reward. We use these findings to explain the design choices and remaining weaknesses of the system.</w:t>
       </w:r>
     </w:p>
     <w:p>
@@ -176,7 +176,7 @@
           <w:rFonts w:ascii="Arial" w:hAnsi="Arial"/>
           <w:sz w:val="22"/>
         </w:rPr>
-        <w:t>2.1 Methodological context</w:t>
+        <w:t>2.1 How related work informed our design</w:t>
       </w:r>
     </w:p>
     <w:p>
@@ -185,7 +185,7 @@
           <w:rFonts w:ascii="Arial" w:hAnsi="Arial"/>
           <w:sz w:val="22"/>
         </w:rPr>
-        <w:t>LinUCB [3] provides context-dependent reward estimation and an uncertainty bonus. Thompson sampling [4] motivates sampling from a posterior, but SAPS samples only its auxiliary Beta outcome term; its reward backbone remains UCB. Constrained bandit research [5,6] motivates separating utility from restrictions. Our hand-authored predicates and heuristic bonus do not inherit those papers’ formal safety guarantees.</w:t>
+        <w:t>We used LinUCB [3] as the starting point because it learns from sequential feedback and gives an explicit exploration term. Thompson sampling [4] suggested a way to represent uncertainty in an additional outcome signal. We combined these ideas in SAPS: reward remains UCB-based, while the auxiliary Beta term is sampled. Work on constrained bandits [5,6] also motivated keeping restrictions separate from utility, although our implementation does not provide those methods’ formal guarantees.</w:t>
       </w:r>
     </w:p>
     <w:p>
@@ -194,7 +194,7 @@
           <w:rFonts w:ascii="Arial" w:hAnsi="Arial"/>
           <w:sz w:val="22"/>
         </w:rPr>
-        <w:t>Neural contextual bandits [7] are relevant references, but our inherited NeuralUCB-labelled implementation differs substantially from gradient-UCB. Interactive narrative [8] and self-determination theory [9] motivate presentation with autonomy and achievable progression. These sources motivate a design; they do not validate our simulator or demonstrate adherence gains. Clinical exercise literature [10,11] is background rather than a per-record provenance or safety certification.</w:t>
+        <w:t>The interface draws on interactive narrative [8] and the emphasis on autonomy in self-determination theory [9]. We used these ideas to design changing tones and small achievements, rather than assuming that more encouragement is always better. Neural contextual bandits [7] provide a recommendation reference. Clinical exercise literature [10,11] provides background for the scenario, but was not used as a validated, per-task source for our catalogue.</w:t>
       </w:r>
     </w:p>
     <w:p>
@@ -206,7 +206,7 @@
           <w:rFonts w:ascii="Arial" w:hAnsi="Arial"/>
           <w:sz w:val="22"/>
         </w:rPr>
-        <w:t>2.2 Dataset origin and preparation</w:t>
+        <w:t>2.2 Why we used synthetic data</w:t>
       </w:r>
     </w:p>
     <w:p>
@@ -215,7 +215,7 @@
           <w:rFonts w:ascii="Arial" w:hAnsi="Arial"/>
           <w:sz w:val="22"/>
         </w:rPr>
-        <w:t>All experiment inputs are repository-authored synthetic JSON. No Kaggle dataset, public patient interaction log, identifiable record or real clinical training sample is used. Static files are loaded into profile/task dictionaries; long condition names are normalized for narrative arc lookup. The repository does not preserve a complete per-record human-versus-AI authorship log or clinical sign-off, so neither is asserted.</w:t>
+        <w:t>We used project-authored synthetic JSON to develop and compare the complete interaction loop without collecting identifiable patient information. It lets us vary symptoms, task difficulty and behavioral assumptions in a controlled setting. It also makes the resulting conclusions conditional on those assumptions. The inputs are not a public patient dataset, and the repository does not contain complete per-record authorship records or clinician validation.</w:t>
       </w:r>
     </w:p>
     <w:tbl>
@@ -430,7 +430,7 @@
           <w:rFonts w:ascii="Arial" w:hAnsi="Arial"/>
           <w:sz w:val="22"/>
         </w:rPr>
-        <w:t>The five runtime pre-filter rules are distinct from the 51 design definitions: those definitions are not 51 predicates executed on each task. Inputs are distributed with the code; experiment scripts regenerate outputs, not the authored dataset. data/README.md documents fields, processing, sources and limitations.</w:t>
+        <w:t>We load profiles and tasks into dictionaries, retain catalogue IDs across the pipeline and normalize condition names for narrative lookup. The 51 design-rule definitions describe the intended domain; five pre-filter predicates are implemented at runtime. We therefore evaluate those five predicates explicitly instead of treating all design definitions as enforced rules. Data fields and provenance are documented in data/README.md.</w:t>
       </w:r>
     </w:p>
     <w:p>
@@ -451,7 +451,7 @@
           <w:rFonts w:ascii="Arial" w:hAnsi="Arial"/>
           <w:sz w:val="22"/>
         </w:rPr>
-        <w:t>At each day t, context x_t describes symptoms, profile and interaction history. The system retrieves feasible catalogue items F_t, ranks them and delivers a one-task recommendation. An attempted task generates feedback and reward; a skip is recorded without an observed physical outcome. The objective is accumulated simulated utility subject to specified feasibility predicates, not maximization of clinical recovery.</w:t>
+        <w:t>At day t, the input is a profile and context x_t containing current symptoms and interaction history. The system constructs a feasible set F_t, ranks it and offers one task. In the benchmark, a simulated user chooses whether to attempt it and generates an outcome; in the live agent, the user supplies that information. We seek useful repeated recommendations under the implemented constraints, using cumulative simulated utility as the experimental objective.</w:t>
       </w:r>
     </w:p>
     <w:p>
@@ -460,7 +460,7 @@
           <w:rFonts w:ascii="Arial" w:hAnsi="Arial"/>
           <w:sz w:val="22"/>
         </w:rPr>
-        <w:t>Synthetic profiles keep clinical stage fixed; narrative day never advances a medical stage. Simulator equations, thresholds and reward terms are assumptions. The benchmark does not apply the live agent’s extra body-part/preference retrieval restriction, so some benchmark proposals are cross-body tasks. This limits the clinical relevance of both reward and rule-based safety rates.</w:t>
+        <w:t>We keep clinical stage fixed in each profile. Story progression is a separate presentation choice: reaching a later act does not mean a patient has medically recovered. This distinction allowed us to build a complete 60-day narrative without pretending to infer clinical milestones from the passage of time alone.</w:t>
       </w:r>
     </w:p>
     <w:p>
@@ -481,7 +481,7 @@
           <w:rFonts w:ascii="Arial" w:hAnsi="Arial"/>
           <w:sz w:val="22"/>
         </w:rPr>
-        <w:t>3. Proposed system and conversational agent</w:t>
+        <w:t>3. System design: from pipeline to conversational agent</w:t>
       </w:r>
     </w:p>
     <w:p>
@@ -493,7 +493,7 @@
           <w:rFonts w:ascii="Arial" w:hAnsi="Arial"/>
           <w:sz w:val="22"/>
         </w:rPr>
-        <w:t>3.1 Integrated architecture</w:t>
+        <w:t>3.1 Separating the responsibilities</w:t>
       </w:r>
     </w:p>
     <w:p>
@@ -502,7 +502,7 @@
           <w:rFonts w:ascii="Arial" w:hAnsi="Arial"/>
           <w:sz w:val="22"/>
         </w:rPr>
-        <w:t>The benchmark composes five functional components: User Simulator → Safety pre-filter/emotional cap → Recommender → Safety post-check → Narrator → simulated choice/outcome → Reward Composer/model updates → Narrator closing. Safety and narration therefore appear at multiple points; a display order is not substituted for the actual execution order.</w:t>
+        <w:t>We first implemented the benchmark loop so that ranking, filtering, feedback and narration could run together. Its daily sequence is User Simulator state → Safety pre-filter and emotional cap → Recommender → Safety post-check → Narrator → simulated choice/outcome → Reward Composer and model updates → daily closing. Keeping these responsibilities separate made it possible to change the interaction layer without rebuilding the recommender.</w:t>
       </w:r>
     </w:p>
     <w:p>
@@ -511,7 +511,7 @@
           <w:rFonts w:ascii="Arial" w:hAnsi="Arial"/>
           <w:sz w:val="22"/>
         </w:rPr>
-        <w:t>The live path replaces simulated behavior with explicit user input. An OpenAI-compatible LLM (default gpt-4o-mini) interprets English and selects tools. Python tools reuse context construction, memory, SAPS, Safety and template narration. The Simulator’s Reward Composer function is reused, but live sessions never call simulated state, choice or outcome generation.</w:t>
+        <w:t>The simulation could show a trajectory, but could not let someone ask for a different exercise or explain how they felt today. We therefore added an LLM-controlled tool layer. The model, default gpt-4o-mini, interprets English and chooses tools for check-in, preferences, retrieval, ranking, explanation and feedback. Those tools call the existing components. The live path uses actual reports and reuses only the Simulator’s reward function, not its generated patient behavior.</w:t>
       </w:r>
     </w:p>
     <w:p>
@@ -520,7 +520,7 @@
           <w:rFonts w:ascii="Arial" w:hAnsi="Arial"/>
           <w:sz w:val="22"/>
         </w:rPr>
-        <w:t>The controller allows at most ten sequential tool decisions per user turn. Tool results return to the model; terminal tools generate the displayed response. Each call must satisfy argument, sequence and evidence checks. Provider failures are visible; no production entry point silently substitutes a scripted planner.</w:t>
+        <w:t>We let the LLM decide the next conversational action while keeping catalogue selection and state changes in Python tools. A tool result becomes input to the next decision, with a maximum of ten decisions per user turn. This gives the agent flexibility to clarify or revise a request while retaining explicit checks on what it can recommend or record.</w:t>
       </w:r>
     </w:p>
     <w:p>
@@ -532,7 +532,7 @@
           <w:rFonts w:ascii="Arial" w:hAnsi="Arial"/>
           <w:sz w:val="22"/>
         </w:rPr>
-        <w:t>3.2 Understanding, retrieval and adaptation</w:t>
+        <w:t>3.2 Making user input affect the recommendation</w:t>
       </w:r>
     </w:p>
     <w:tbl>
@@ -786,7 +786,7 @@
           <w:rFonts w:ascii="Arial" w:hAnsi="Arial"/>
           <w:sz w:val="22"/>
         </w:rPr>
-        <w:t>Guided forms prepare an editable message, then Send invokes the same LLM. They are an input aid, not medical-record import or a second planner. Unknown ROM remains null in the record; a clearly labelled conservative zero-degree proxy is used for existing filtering/features, not treated as a measurement. Satisfaction is stored descriptively and is not in the reward formula.</w:t>
+        <w:t>We also added guided forms because entering every symptom as a precise English sentence is an awkward starting point for a demo. A form prepares an editable check-in, then Send invokes the same LLM. Unknown ROM stays unknown in the record; existing filtering uses a disclosed conservative zero-degree proxy. Preferences change retrieval directly, so a request such as avoiding flexibility can change the actual candidate set rather than only the wording of the response.</w:t>
       </w:r>
     </w:p>
     <w:p>
@@ -798,7 +798,7 @@
           <w:rFonts w:ascii="Arial" w:hAnsi="Arial"/>
           <w:sz w:val="22"/>
         </w:rPr>
-        <w:t>3.3 Safety boundaries and memory</w:t>
+        <w:t>3.3 Decisions about control and feedback</w:t>
       </w:r>
     </w:p>
     <w:p>
@@ -807,7 +807,7 @@
           <w:rFonts w:ascii="Arial" w:hAnsi="Arial"/>
           <w:sz w:val="22"/>
         </w:rPr>
-        <w:t>Tool guards reject invented catalogue IDs, stale plans and numeric values lacking matching evidence. Explicit pain preventing every task permits an unperformed pause, without adding an arbitrary numeric cutoff. Ordinary days aim to offer a feasible task, including suitable recovery activity, while the user may decline. Red-flag keyword detection creates a hold before LLM invocation; this limited screen can miss or misclassify concerns.</w:t>
+        <w:t>We distinguish having a task from being required to complete it. On an ordinary day the system aims to offer a suitable task, including recovery activity; a user may decline it. An explicit report that pain prevents every task allows an unperformed pause. A limited red-flag keyword screen places the session on hold before the LLM is called. Neither case is converted into a successful exercise outcome.</w:t>
       </w:r>
     </w:p>
     <w:p>
@@ -816,7 +816,7 @@
           <w:rFonts w:ascii="Arial" w:hAnsi="Arial"/>
           <w:sz w:val="22"/>
         </w:rPr>
-        <w:t>Sessions own separate learners and memory; they do not load benchmark posteriors. Clinical stage and contraindications cannot be rewritten by the LLM. No persistent patient record or clinician approval workflow is implemented. Bounded tool use covers the assignment’s suggested capabilities, but engineering checks cannot establish unrestricted language robustness or healthcare suitability.</w:t>
+        <w:t>Each session has its own learner and memory. The LLM cannot rewrite clinical stage or contraindications, invent a catalogue item or treat an intention as completion. A preference revision invalidates the old ranking, and a new day requires a fresh check-in. These rules were important when turning the benchmark into a conversation: a fluent response alone does not tell us whether the underlying recommendation or update is valid. Tool contracts are detailed in docs/conversational_agent.md.</w:t>
       </w:r>
     </w:p>
     <w:p>
@@ -837,7 +837,7 @@
           <w:rFonts w:ascii="Arial" w:hAnsi="Arial"/>
           <w:sz w:val="22"/>
         </w:rPr>
-        <w:t>4. Ranking, safety and feedback semantics</w:t>
+        <w:t>4. Recommendation method and learning signals</w:t>
       </w:r>
     </w:p>
     <w:p>
@@ -858,7 +858,7 @@
           <w:rFonts w:ascii="Arial" w:hAnsi="Arial"/>
           <w:sz w:val="22"/>
         </w:rPr>
-        <w:t>Context combines pain, fatigue, ROM, mood, age, time since surgery, fixed stage, recent completion/intensity, feedback counts, BMI, baseline symptoms and motivation. Explicit category preference is not an extra bandit feature; live preferences change retrieval.</w:t>
+        <w:t>We represent the user with 15 context features covering symptoms, ROM, mood, profile information and recent interaction history. We chose a disjoint LinUCB backbone to learn a separate reward estimate for each task while conditioning on the current user state. Explicit category preferences are handled by live retrieval, rather than added as a new bandit feature.</w:t>
       </w:r>
     </w:p>
     <w:p>
@@ -867,7 +867,7 @@
           <w:rFonts w:ascii="Arial" w:hAnsi="Arial"/>
           <w:sz w:val="22"/>
         </w:rPr>
-        <w:t>For task a and 15-dimensional context x, initialize A_a = I and b_a = 0. Then θ_a = A_a⁻¹b_a and r_ucb(a) = θ_aᵀx + α√(xᵀA_a⁻¹x). SAPS uses S(a) = r_ucb(a) + τ_safe s_a, where s_a ~ Beta(α_a, β_a). We use α = 1, τ_safe = 2 and Beta(1,1) priors. Only the auxiliary outcome term is sampled; this is not Thompson sampling of the reward posterior.</w:t>
+        <w:t>For task a and context x, we initialize A_a = I and b_a = 0. With θ_a = A_a⁻¹b_a, the reward score is r_ucb(a) = θ_aᵀx + α√(xᵀA_a⁻¹x). SAPS adds S(a) = r_ucb(a) + τ_safe s_a, where s_a ~ Beta(α_a, β_a). We use α = 1, τ_safe = 2 and Beta(1,1) priors. The UCB term balances estimated reward and exploration; the sampled term favors tasks associated with acceptable symptom changes.</w:t>
       </w:r>
     </w:p>
     <w:p>
@@ -876,7 +876,7 @@
           <w:rFonts w:ascii="Arial" w:hAnsi="Arial"/>
           <w:sz w:val="22"/>
         </w:rPr>
-        <w:t>After an attempted task, reward updates A_a ← A_a + xxᵀ and b_a ← b_a + rx. Its Beta positive count increments if pain_change &lt;= 1.0; otherwise the negative count increments. This threshold is an authored symptom-change proxy, not a clinical adverse-event label. Beta parameters are per task and shared across users, without decay or a contextual posterior, limiting personalization and response to change.</w:t>
+        <w:t>After an attempted task, we update A_a ← A_a + xxᵀ and b_a ← b_a + rx. We increment the Beta positive count when pain_change &lt;= 1.0 and its negative count otherwise. This is a simple authored outcome proxy. The Beta state is indexed by task, shared across users and has no decay, whereas the reward estimate depends on user context. This makes SAPS a task-specific adaptation, not a new clinically calibrated risk model.</w:t>
       </w:r>
     </w:p>
     <w:p>
@@ -885,7 +885,7 @@
           <w:rFonts w:ascii="Arial" w:hAnsi="Arial"/>
           <w:sz w:val="22"/>
         </w:rPr>
-        <w:t>The adaptation is motivated by asymmetric costs: reward estimates alone need not discourage tasks associated with symptom increases. The auxiliary posterior can bias proposals, while independent hard filtering constrains delivery. Whether the bonus helps is an empirical question; the final ablation does not demonstrate a benefit.</w:t>
+        <w:t>We designed the bonus to influence what the learner proposes, but did not rely on it to enforce restrictions. A task with a high estimated reward or a favorable Beta sample still has to pass the hard checks. This led to two separate experimental questions: whether the sampled bonus helps ranking, and whether runtime filtering prevents delivery of rule-infeasible tasks.</w:t>
       </w:r>
     </w:p>
     <w:p>
@@ -897,7 +897,7 @@
           <w:rFonts w:ascii="Arial" w:hAnsi="Arial"/>
           <w:sz w:val="22"/>
         </w:rPr>
-        <w:t>4.2 Runtime constraints versus soft terms</w:t>
+        <w:t>4.2 Why we kept a hard safety layer</w:t>
       </w:r>
     </w:p>
     <w:p>
@@ -906,7 +906,7 @@
           <w:rFonts w:ascii="Arial" w:hAnsi="Arial"/>
           <w:sz w:val="22"/>
         </w:rPr>
-        <w:t>PF_R1 excludes contraindication overlaps; PF_R2 excludes stage mismatches; PF_R3 excludes difficulty ≥4 when pain ≥7; PF_R4 limits fatigue ≥8 to rest/flexibility; PF_R5 excludes difficulty ≥3 or cardio when ROM &lt;60. Emotional caps and post-checks add restrictions, including consecutive high-intensity limits. A final validation checks delivered items. Recovery fallbacks must pass the same checks; an empty catalogue coverage gap raises an error rather than restoring an unsafe item.</w:t>
+        <w:t>The pre-filter applies five checks: contraindication overlap; stage mismatch; pain ≥7 with difficulty ≥4; fatigue ≥8 with a category other than rest/flexibility; and ROM &lt;60 with difficulty ≥3 or cardio. Emotional caps and post-checks add restrictions, including consecutive high-intensity limits. We recheck a recovery fallback as well as the first recommendation, so that fallback logic cannot undo an earlier restriction.</w:t>
       </w:r>
     </w:p>
     <w:p>
@@ -915,7 +915,7 @@
           <w:rFonts w:ascii="Arial" w:hAnsi="Arial"/>
           <w:sz w:val="22"/>
         </w:rPr>
-        <w:t>These predicates remain constraints regardless of the bonus value. A score drifting does not disable a predicate; however, an incomplete or incorrectly specified predicate can fail to capture real harm. Zero SVR therefore means compliance with implemented rules in observed cases, not proof that real patients are protected.</w:t>
+        <w:t>This design answers a practical concern about adaptive scores: changing the learned bonus does not change the hard predicates. However, their usefulness still depends on whether the predicates describe the domain correctly. We evaluate rule compliance in the simulator and reserve clinical safety claims for future validation of the tasks and constraints.</w:t>
       </w:r>
     </w:p>
     <w:p>
@@ -927,7 +927,7 @@
           <w:rFonts w:ascii="Arial" w:hAnsi="Arial"/>
           <w:sz w:val="22"/>
         </w:rPr>
-        <w:t>4.3 Reward and skipped-task correction</w:t>
+        <w:t>4.3 Designing and correcting the feedback signal</w:t>
       </w:r>
     </w:p>
     <w:p>
@@ -936,7 +936,7 @@
           <w:rFonts w:ascii="Arial" w:hAnsi="Arial"/>
           <w:sz w:val="22"/>
         </w:rPr>
-        <w:t>For attempted tasks, r = 0.35 c + 0.25 s + 0.20 d + 0.10 p + 0.05 q + 0.05 g, clipped to [0,1]. Here c is completion; s is a pain-change safety proxy; d is a Gaussian difficulty match to stress-dependent ideal difficulty (width 1.5); p penalizes positive pain change; q indicates non-skip; g is state-dependent category appropriateness. These are hand-designed utility terms, not a learned clinical endpoint.</w:t>
+        <w:t>Our reward combines completion, symptom response and task fit: r = 0.35 c + 0.25 s + 0.20 d + 0.10 p + 0.05 q + 0.05 g, clipped to [0,1]. The terms are completion, pain-change safety, difficulty match, pain penalty, non-skip and category appropriateness. Difficulty match uses a Gaussian around a stress-dependent ideal difficulty, with width 1.5. Completion receives the largest weight because delivering a task that is never completed is not enough. These weights are design choices, not tuned clinical utilities; satisfaction is stored but does not enter reward.</w:t>
       </w:r>
     </w:p>
     <w:p>
@@ -945,7 +945,7 @@
           <w:rFonts w:ascii="Arial" w:hAnsi="Arial"/>
           <w:sz w:val="22"/>
         </w:rPr>
-        <w:t>Skips no longer generate pain/fatigue/ROM/satisfaction, chosen-arm reward updates or Beta observations. Their zero in benchmark sums is bookkeeping with reward_observed=false. Only completed feedback increments recovery completion counts. The diagnostic raw ranking still supplies known infeasible-arm penalty updates, even on a skip; those are constraint labels rather than fabricated physical outcomes. Calendar/condition normalization is also corrected, and all final experiments use that source.</w:t>
+        <w:t>Reviewing the feedback path exposed an important mismatch: a skipped task could still produce simulated physical feedback. We corrected it so a skip produces no pain/fatigue/ROM/satisfaction outcome, chosen-arm reward update or Beta observation. Its zero in reward totals is bookkeeping only; completion counters increase only for completed tasks. Known infeasible-arm penalties remain separate constraint updates. We reran the experiments after these corrections rather than comparing incompatible reward totals.</w:t>
       </w:r>
     </w:p>
     <w:p>
@@ -966,7 +966,7 @@
           <w:rFonts w:ascii="Arial" w:hAnsi="Arial"/>
           <w:sz w:val="22"/>
         </w:rPr>
-        <w:t>5. Experimental setup and metric rationale</w:t>
+        <w:t>5. Experimental design</w:t>
       </w:r>
     </w:p>
     <w:p>
@@ -978,7 +978,7 @@
           <w:rFonts w:ascii="Arial" w:hAnsi="Arial"/>
           <w:sz w:val="22"/>
         </w:rPr>
-        <w:t>5.1 Online protocol and data separation</w:t>
+        <w:t>5.1 Questions and online protocol</w:t>
       </w:r>
     </w:p>
     <w:p>
@@ -987,7 +987,7 @@
           <w:rFonts w:ascii="Arial" w:hAnsi="Arial"/>
           <w:sz w:val="22"/>
         </w:rPr>
-        <w:t>Each primary run uses all 20 personas for 60 days with one shared learner and one offered task per user-day. Prediction precedes outcome observation. There is no conventional offline training/validation/test split or public supervised ground truth. Learning proceeds inside rollouts; no pretrained model is required.</w:t>
+        <w:t>We organized evaluation around three questions: how the policies compare on useful daily recommendations; what the bonus and hard filter each contribute; and how the displayed shortlist affects the simulator’s choices. Each primary run uses 20 personas for 60 days with one shared learner, one task per user-day and prediction before feedback. Learning takes place online, so there is no conventional offline train/validation/test split.</w:t>
       </w:r>
     </w:p>
     <w:p>
@@ -996,7 +996,7 @@
           <w:rFonts w:ascii="Arial" w:hAnsi="Arial"/>
           <w:sz w:val="22"/>
         </w:rPr>
-        <w:t>Development diagnostics use seeds 42–51. Top-1 was chosen to match the live one-task interaction before inspecting these outcomes, rather than selecting the highest-reward setting. Final comparison uses previously uninspected seeds 52–61 with the same personas and simulator. This separates stochastic runs, not real patients or independent data-generating environments. No tau grid or broad performance tuning is performed.</w:t>
+        <w:t>The initial benchmark offered three tasks, whereas the live agent presents one. We chose Top-1 as the final common setting to match that interaction, and used seeds 42–51 to diagnose Top-1 versus Top-3. Final comparisons use previously uninspected seeds 52–61 with the same personas. This gives repeated stochastic runs, not held-out patient validation. We kept tau fixed instead of searching for a setting that would make the final comparison favorable.</w:t>
       </w:r>
     </w:p>
     <w:tbl>
@@ -1253,7 +1253,7 @@
           <w:rFonts w:ascii="Arial" w:hAnsi="Arial"/>
           <w:sz w:val="22"/>
         </w:rPr>
-        <w:t>5.2 Baselines and comparability</w:t>
+        <w:t>5.2 Why these baselines</w:t>
       </w:r>
     </w:p>
     <w:p>
@@ -1262,7 +1262,7 @@
           <w:rFonts w:ascii="Arial" w:hAnsi="Arial"/>
           <w:sz w:val="22"/>
         </w:rPr>
-        <w:t>LinUCB is the direct reward-backbone reference; Random tests whether learned ranking improves on feasible random selection. Popularity and epsilon-greedy exploit historical mean rewards. The inherited RuleBased scorer assigns the same score to every candidate, with stable catalogue order resolving ties. Modified NeuralUCB adds an arm-common context prediction to arm statistics/noise, so that prediction cancels in ranking; it also uses a stronger inherited infeasible-arm penalty. These limited references must not be presented as a strong clinical ranker or the original NeuralUCB [7].</w:t>
+        <w:t>LinUCB isolates the reward backbone; Random tests whether learning improves on feasible random selection. Popularity and epsilon-greedy provide simpler reward-history references. We also report the implemented RuleBased and modified NeuralUCB variants, with limitations: RuleBased ties all candidates, while the neural variant’s shared context term cancels in ranking and it uses a stronger infeasible-arm penalty. It is not the original gradient-UCB method [7]. LinUCB and Random are therefore the most informative comparisons for our main question.</w:t>
       </w:r>
     </w:p>
     <w:p>
@@ -1274,7 +1274,7 @@
           <w:rFonts w:ascii="Arial" w:hAnsi="Arial"/>
           <w:sz w:val="22"/>
         </w:rPr>
-        <w:t>5.3 Metrics and why they match the task</w:t>
+        <w:t>5.3 Choosing metrics for this task</w:t>
       </w:r>
     </w:p>
     <w:p>
@@ -1283,7 +1283,7 @@
           <w:rFonts w:ascii="Arial" w:hAnsi="Arial"/>
           <w:sz w:val="22"/>
         </w:rPr>
-        <w:t>Primary utility is mean per-user cumulative reward. Acceptance = attempted tasks / scheduled user-days; completion = completed tasks / scheduled user-days. Both expose behavior hidden by reward aggregation, but are simulated outcomes, not observed adherence. Selected-task coverage counts distinct offered/selected IDs per user, including declined items; it is descriptive.</w:t>
+        <w:t>We use mean per-user cumulative reward to summarize the 60-day interaction, and acceptance and completion to show whether offered tasks are attempted and finished. Both rates divide by scheduled user-days. We also count distinct selected tasks per user, including declined tasks, to examine breadth. These measures match our sequential task more closely than treating a simulator-chosen item as independent relevance ground truth for Recall or NDCG.</w:t>
       </w:r>
     </w:p>
     <w:p>
@@ -1292,7 +1292,7 @@
           <w:rFonts w:ascii="Arial" w:hAnsi="Arial"/>
           <w:sz w:val="22"/>
         </w:rPr>
-        <w:t>SVR = rule-violating accepted tasks / accepted tasks, macro-averaged over users then seeds; users with no acceptance contribute zero. IER is the mean fraction of an ungated all-catalogue top-5 outside the current feasible set. SAPS explicitly bypasses its internal gate for this probe. IER exposes proposal burden hidden by a zero executed SVR, but low IER does not alone prove learning or safety. The stochastic probe also drives penalty updates, so is not passive instrumentation.</w:t>
+        <w:t>Safety needs two views. SVR counts rule-violating accepted tasks divided by accepted tasks, averaged over users then seeds; users with no attempts contribute zero. IER counts the fraction of an ungated all-catalogue top-5 outside the current feasible set, then averages interactions. It reveals proposals hidden by a zero executed SVR. We bypass SAPS’s internal output gate for this calculation; the probe also drives infeasible-arm penalties, so it is part of the training path as well as a diagnostic.</w:t>
       </w:r>
     </w:p>
     <w:p>
@@ -1301,7 +1301,7 @@
           <w:rFonts w:ascii="Arial" w:hAnsi="Arial"/>
           <w:sz w:val="22"/>
         </w:rPr>
-        <w:t>Paired two-sided t intervals/tests use ten seed means, not users as independent replicates. Main reward comparisons apply Bonferroni correction across SAPS–LinUCB/Random; the bonus family covers reward/IER/acceptance. Different policies consume randomness differently despite matching seeds. Recall/NDCG against a chosen task would recycle simulator choice as relevance, so are not treated as independent ranking ground truth.</w:t>
+        <w:t>We compare ten seed means with paired two-sided t intervals/tests. Bonferroni correction covers the two main reward comparisons and, separately, three bonus outcomes. Users share a learner and are not independent repetitions. Matching seeds also does not align every realized outcome across policies, because their choices consume randomness differently. Exact settings and reproduction instructions are in evaluation/README.md.</w:t>
       </w:r>
     </w:p>
     <w:p>
@@ -1334,7 +1334,7 @@
           <w:rFonts w:ascii="Arial" w:hAnsi="Arial"/>
           <w:sz w:val="22"/>
         </w:rPr>
-        <w:t>6.1 Main comparison: final top-1 protocol</w:t>
+        <w:t>6.1 Comparing the final one-task policies</w:t>
       </w:r>
     </w:p>
     <w:p>
@@ -1343,7 +1343,7 @@
           <w:rFonts w:ascii="Arial" w:hAnsi="Arial"/>
           <w:sz w:val="22"/>
         </w:rPr>
-        <w:t>Table 1 reports mean per-person 60-day cumulative reward, averaged across ten final seeds; ± denotes seed standard deviation, not patient uncertainty. Acceptance and completion are fractions of scheduled user-days. All final source and configuration fingerprints are stored in protocol.json.</w:t>
+        <w:t>Table 1 summarizes our final Top-1 experiment. Reward is mean per-person cumulative utility over 60 days, averaged across ten seeds; ± is seed standard deviation. Acceptance and completion show the behavior behind that total.</w:t>
       </w:r>
     </w:p>
     <w:tbl>
@@ -2086,7 +2086,7 @@
           <w:rFonts w:ascii="Arial" w:hAnsi="Arial"/>
           <w:sz w:val="22"/>
         </w:rPr>
-        <w:t>Table 1. All seven filtered policies have macro SVR = 0 and assigned fraction = 1 over their observed runs. Those checks cover specified predicates, not all clinical contraindications or the 51 design definitions. The complete values and per-user/per-run observations are in evaluation/results/final/main.json.</w:t>
+        <w:t>Table 1. All seven filtered policies recorded SVR = 0 and offered a task on every simulated user-day. Detailed runs are stored in evaluation/results/final/main.json.</w:t>
       </w:r>
     </w:p>
     <w:p>
@@ -2095,7 +2095,7 @@
           <w:rFonts w:ascii="Arial" w:hAnsi="Arial"/>
           <w:sz w:val="22"/>
         </w:rPr>
-        <w:t>SAPS reward is 27.6085 versus LinUCB 27.3975: difference +0.2110, seed-paired 95% CI [−0.2159, 0.6378], raw p=0.2925 and adjusted p=0.5850. This is not evidence of a reward improvement. IER is also nearly identical (0.01535 versus 0.01528), rather than showing the sampled bonus improves proposals.</w:t>
+        <w:t>SAPS reaches reward 27.6085 compared with LinUCB’s 27.3975. The difference is +0.2110, with a seed-paired 95% CI [−0.2159, 0.6378], raw p=0.2925 and adjusted p=0.5850. The improvement is too uncertain to support a performance claim. Their IER values are also close: 0.01535 and 0.01528. Adding the sampled term therefore changes the method, but has not demonstrated a useful gain in this setting.</w:t>
       </w:r>
     </w:p>
     <w:p>
@@ -2104,7 +2104,7 @@
           <w:rFonts w:ascii="Arial" w:hAnsi="Arial"/>
           <w:sz w:val="22"/>
         </w:rPr>
-        <w:t>Random reward is 32.2533, above SAPS by 4.6448. SAPS–Random 95% CI is [−5.1902, −4.0994] with adjusted p=2.53×10⁻⁸. Random has high raw IER (0.41082), but its delivered tasks are filtered and its SVR is zero. Thus lower proposal infeasibility is not sufficient to justify SAPS as the better delivered recommender in this environment.</w:t>
+        <w:t>Random is the strongest policy on reward at 32.2533. SAPS–Random has a 95% CI [−5.1902, −4.0994] and adjusted p=2.53×10⁻⁸. Random also has high proposal IER (0.41082), but the shared filter keeps its delivered SVR at zero. This distinction matters: our system can intercept poor proposals without making the learned ranking better than random selection. We report this result alongside the shortlist and coverage diagnostics below.</w:t>
       </w:r>
     </w:p>
     <w:p>
@@ -2116,7 +2116,7 @@
           <w:rFonts w:ascii="Arial" w:hAnsi="Arial"/>
           <w:sz w:val="22"/>
         </w:rPr>
-        <w:t>6.2 What the results establish</w:t>
+        <w:t>6.2 Reading the metrics together</w:t>
       </w:r>
     </w:p>
     <w:p>
@@ -2125,7 +2125,7 @@
           <w:rFonts w:ascii="Arial" w:hAnsi="Arial"/>
           <w:sz w:val="22"/>
         </w:rPr>
-        <w:t>The hard layer makes filtered policies comply with implemented predicates in the sampled cohort; the rankers differ in simulated utility, acceptance and task breadth. IER measures a different layer from SVR and is useful for inspection, but is not a substitute for accepted-task utility. A rule-infeasible raw proposal is not an observed adverse clinical event.</w:t>
+        <w:t>Looking only at SVR would make the filtered policies appear identical. Looking only at IER would favor very conservative proposals. Reward and completion add the missing question of whether users actually get useful, manageable tasks. We therefore interpret the table as a set of tradeoffs rather than use a single safety number to declare a winning recommender.</w:t>
       </w:r>
     </w:p>
     <w:p>
@@ -2134,7 +2134,7 @@
           <w:rFonts w:ascii="Arial" w:hAnsi="Arial"/>
           <w:sz w:val="22"/>
         </w:rPr>
-        <w:t>The especially low IER of modified NeuralUCB accompanies low reward and approximately one distinct task per user, not a uniquely successful recommender. Safety-informed initialization and penalized arm statistics can make a narrow policy appear good on proposal feasibility. RuleBased’s poor ranking validity and catalogue-order ties further limit its value as evidence of SAPS superiority.</w:t>
+        <w:t>For example, modified NeuralUCB has the lowest IER, but low reward and approximately one distinct selected task per user. Its safety-informed initialization and arm penalties can produce narrow recommendations. The RuleBased result also needs caution because its tied scores preserve catalogue order. These observations helped us distinguish implementation behavior from the name or complexity of a policy.</w:t>
       </w:r>
     </w:p>
     <w:p>
@@ -2146,7 +2146,7 @@
           <w:rFonts w:ascii="Arial" w:hAnsi="Arial"/>
           <w:sz w:val="22"/>
         </w:rPr>
-        <w:t>6.3 Relation to earlier results</w:t>
+        <w:t>6.3 What this changed in our interpretation</w:t>
       </w:r>
     </w:p>
     <w:p>
@@ -2155,7 +2155,7 @@
           <w:rFonts w:ascii="Arial" w:hAnsi="Arial"/>
           <w:sz w:val="22"/>
         </w:rPr>
-        <w:t>Earlier presentation tables used a different shortlist and skipped-task outcome semantics. Those bytes and reports are preserved under archive/pre-submission, but are superseded as evidence for this final source. Reward differences across versions are not performance gains or losses under an unchanged protocol. Final conclusions use only the rerun artifacts cited here.</w:t>
+        <w:t>Moving from a list-based benchmark to a one-task agent made the choice interface an important design issue. Correcting skipped-task feedback also changed what a reward total represented. We therefore reran a consistent setting and kept the earlier presentation tables separate, rather than treating a difference across versions as an algorithmic improvement. The development shortlist diagnostic and final bonus ablation below examine those mechanisms alongside the primary comparison.</w:t>
       </w:r>
     </w:p>
     <w:p>
@@ -2176,7 +2176,7 @@
           <w:rFonts w:ascii="Arial" w:hAnsi="Arial"/>
           <w:sz w:val="22"/>
         </w:rPr>
-        <w:t>6.4 Shortlist and coverage diagnostics</w:t>
+        <w:t>6.4 Investigating shortlist size and task coverage</w:t>
       </w:r>
     </w:p>
     <w:p>
@@ -2185,7 +2185,7 @@
           <w:rFonts w:ascii="Arial" w:hAnsi="Arial"/>
           <w:sz w:val="22"/>
         </w:rPr>
-        <w:t>The development experiment compares top-1 and top-3 for SAPS, LinUCB and Random using ten seeds 42–51. The simulated user selects the highest-utility candidate with noise, so changing shortlist size changes the decision problem and stochastic draw consumption. This is not Precision@1 versus Precision@3 on a fixed relevance set.</w:t>
+        <w:t>To understand how the interface affects evaluation, we compared Top-1 and Top-3 for SAPS, LinUCB and Random on development seeds 42–51. With three items, the simulated user chooses the highest-utility candidate with noise before deciding whether to attempt it. A ranker can therefore benefit from giving the simulator more choice, even if its first item is unchanged in quality.</w:t>
       </w:r>
     </w:p>
     <w:tbl>
@@ -2838,7 +2838,7 @@
           <w:rFonts w:ascii="Arial" w:hAnsi="Arial"/>
           <w:sz w:val="22"/>
         </w:rPr>
-        <w:t>Table 2. Coverage counts selected IDs even if the user subsequently declines. Top-3 lets the simulator choose a non-first item in roughly two-thirds of interactions. Reward rises for every diagnostic policy. Therefore previous list-based reward is partly a property of the choice interface, and cannot establish superiority for a single delivered task.</w:t>
+        <w:t>Table 2. With Top-3, the selected task is not the first item in roughly two-thirds of interactions. Reward rises for all three policies. This confirmed that shortlist size is a substantive experimental setting, not just a display preference. We keep Top-1 as the main comparison because it matches the live agent’s one-task output; Top-3 remains a separate diagnostic.</w:t>
       </w:r>
     </w:p>
     <w:p>
@@ -2847,7 +2847,7 @@
           <w:rFonts w:ascii="Arial" w:hAnsi="Arial"/>
           <w:sz w:val="22"/>
         </w:rPr>
-        <w:t>Random covers approximately 37 items per user versus 18 for SAPS, and its reward advantage persists under both settings. This is consistent with broader exploration mattering in a simulator that includes novelty, but does not establish coverage as the cause: difficulty, category, utility assumptions and different sampled histories are confounded. Task/category/difficulty counts are recorded for inspection; no diversity intervention or causal coverage claim is made.</w:t>
+        <w:t>We also examined coverage because Random’s advantage persists at both list sizes. It selects approximately 37 distinct tasks per user, compared with about 18 for SAPS. Broader exploration is a plausible contributor in a simulator whose choice utility includes novelty, but coverage, task difficulty, category and sampled histories change together. Our counts identify a hypothesis to test; they do not establish the cause of Random’s advantage.</w:t>
       </w:r>
     </w:p>
     <w:p>
@@ -2856,7 +2856,7 @@
           <w:rFonts w:ascii="Arial" w:hAnsi="Arial"/>
           <w:sz w:val="22"/>
         </w:rPr>
-        <w:t>Top-1 remains the final primary setting because it represents the live system, not because it makes SAPS win. Top-3 stays a labelled diagnostic. A future experiment could randomize diversity while holding utility and safety protocols constant, then test on an independently specified simulator or approved real feedback.</w:t>
+        <w:t>The practical lesson is to specify the user’s choice mechanism before comparing policies. A further study could vary diversity while keeping the remaining protocol fixed. That would be more informative than increasing exploration and assuming that any reward gain must have come from coverage.</w:t>
       </w:r>
     </w:p>
     <w:p>
@@ -2868,7 +2868,7 @@
           <w:rFonts w:ascii="Arial" w:hAnsi="Arial"/>
           <w:sz w:val="22"/>
         </w:rPr>
-        <w:t>6.5 Fixed safety-bonus ablation</w:t>
+        <w:t>6.5 Separating the sampled bonus from the filter</w:t>
       </w:r>
     </w:p>
     <w:p>
@@ -2877,7 +2877,7 @@
           <w:rFonts w:ascii="Arial" w:hAnsi="Arial"/>
           <w:sz w:val="22"/>
         </w:rPr>
-        <w:t>With top-1 and final seeds, SAPS τ=2 is compared with τ=0; all other components stay the same. τ=0 matches the LinUCB reference in these runs. This fixed on/off test is not a hyperparameter grid and no favorable tau is selected afterward.</w:t>
+        <w:t>We next removed only the sampled contribution by comparing fixed τ=2 with τ=0 on final Top-1 seeds. The hard layer and other settings stay the same. In these runs, τ=0 matches the LinUCB reference. This ablation tests the reason for adding the term, rather than attributing every safety-related result to SAPS as a whole.</w:t>
       </w:r>
     </w:p>
     <w:tbl>
@@ -3191,7 +3191,7 @@
           <w:rFonts w:ascii="Arial" w:hAnsi="Arial"/>
           <w:sz w:val="22"/>
         </w:rPr>
-        <w:t>Table 3. None of the three tests establishes benefit. IER difference is +0.000067, 95% CI [−0.000339, 0.000473]. A low absolute IER should therefore not be attributed to the bonus: hard candidate restriction, infeasible-arm penalties and the environment can also shape rankings. The contribution supported here is the testable separation of mechanisms, not a proven novel safety advantage.</w:t>
+        <w:t>Table 3. None of the three outcomes shows a supported gain after correction. The IER difference is +0.000067, with 95% CI [−0.000339, 0.000473]. Low overall IER can also reflect candidate restrictions and infeasible-arm penalties. We therefore keep the bonus as an implemented hypothesis, while recognizing that its present task-only posterior and the simulator may offer little additional signal. A parameter search alone would not resolve that question.</w:t>
       </w:r>
     </w:p>
     <w:p>
@@ -3212,7 +3212,7 @@
           <w:rFonts w:ascii="Arial" w:hAnsi="Arial"/>
           <w:sz w:val="22"/>
         </w:rPr>
-        <w:t>6.6 Runtime safety, transfer and narrative checks</w:t>
+        <w:t>6.6 Testing filtering, transfer and narrative behavior</w:t>
       </w:r>
     </w:p>
     <w:p>
@@ -3233,7 +3233,7 @@
           <w:rFonts w:ascii="Arial" w:hAnsi="Arial"/>
           <w:sz w:val="22"/>
         </w:rPr>
-        <w:t>LinUCB with and without runtime safety is rerun over the same ten final seeds. The emotional difficulty cap remains in both arms, so this removes runtime checks rather than all safety-related behavior. Accepted tasks are audited against all five pre-filter predicates, including when filtering is disabled.</w:t>
+        <w:t>We separately ran LinUCB with and without runtime filtering over the ten final seeds. We kept the emotional difficulty cap in both arms and evaluated accepted tasks against the same five pre-filter rules. This tests whether enforcement changes delivered recommendations, independently of the proposed sampled bonus.</w:t>
       </w:r>
     </w:p>
     <w:tbl>
@@ -3474,7 +3474,7 @@
           <w:rFonts w:ascii="Arial" w:hAnsi="Arial"/>
           <w:sz w:val="22"/>
         </w:rPr>
-        <w:t>Table 4. The pooled unfiltered violation rate is 0.1595; macro averaging gives 0.1556 because users have different numbers of attempts. This demonstrates enforcement of authored constraints and its utility tradeoff, not reduction of clinically observed harm. NoSafety changes the feasible-set definition, so its IER is not compared as though it were the same five-rule outcome.</w:t>
+        <w:t>Table 4. Without runtime filtering, the pooled violation rate is 0.1595; the user-macro rate is 0.1556 because attempt counts differ across users. With filtering it is zero. This demonstrates the intended interception mechanism and its reward tradeoff. The labels come from our authored predicates, so the experiment tests rule enforcement rather than clinically observed harm. NoSafety IER uses a changed feasible set and is not treated as the same five-rule outcome.</w:t>
       </w:r>
     </w:p>
     <w:p>
@@ -3486,7 +3486,7 @@
           <w:rFonts w:ascii="Arial" w:hAnsi="Arial"/>
           <w:sz w:val="22"/>
         </w:rPr>
-        <w:t>Exploratory condition-transfer probe</w:t>
+        <w:t>Exploring transfer to another condition</w:t>
       </w:r>
     </w:p>
     <w:p>
@@ -3495,7 +3495,7 @@
           <w:rFonts w:ascii="Arial" w:hAnsi="Arial"/>
           <w:sz w:val="22"/>
         </w:rPr>
-        <w:t>A separate seed-42 probe trains on 15 ACL/RC personas and rolls out on five unseen BP personas. Reward estimates are frozen during transfer; SAPS Beta counts still adapt. The comparison is fresh online learning on BP, not fully frozen transfer or an independently validated clinical cohort.</w:t>
+        <w:t>We also asked whether learned task estimates carry over between our synthetic condition groups. In an exploratory seed-42 experiment, we train on 15 ACL/RC personas, then evaluate on five BP personas. We freeze reward updates in the transfer rollout but allow SAPS Beta updates, and compare with fresh online learning on BP.</w:t>
       </w:r>
     </w:p>
     <w:tbl>
@@ -3736,7 +3736,7 @@
           <w:rFonts w:ascii="Arial" w:hAnsi="Arial"/>
           <w:sz w:val="22"/>
         </w:rPr>
-        <w:t>Table 5. SAPS reward-frozen BP IER is 0.00733 versus fresh-online 0.06000, with lower reward. This again illustrates that a small proposal-feasibility value alone is not recommendation success. The five-person/single-seed probe supports inspection, not a general transfer claim.</w:t>
+        <w:t>Table 5. SAPS’s transferred reward estimates give lower reward than fresh online learning, despite lower IER (0.00733 versus 0.06000). This suggests that conservative transferred proposals are not automatically more useful. With only five personas, one seed and adaptive Beta counts, we treat this as a diagnostic of condition dependence rather than a general transfer result.</w:t>
       </w:r>
     </w:p>
     <w:p>
@@ -3748,7 +3748,7 @@
           <w:rFonts w:ascii="Arial" w:hAnsi="Arial"/>
           <w:sz w:val="22"/>
         </w:rPr>
-        <w:t>Narrative execution and bookkeeping invariants</w:t>
+        <w:t>Making the narrative follow the actual interaction</w:t>
       </w:r>
     </w:p>
     <w:p>
@@ -3757,7 +3757,7 @@
           <w:rFonts w:ascii="Arial" w:hAnsi="Arial"/>
           <w:sz w:val="22"/>
         </w:rPr>
-        <w:t>The 70 main runs contain 84,000 user-days and 168,000 successful render calls: one recommendation and one closing per user-day, with zero recorded fallback. All assigned fractions equal one. Every run checks that skipped tasks have no physical outcome, completed counters match actual completed feedback, and SAPS Beta observation counts equal attempted tasks. Condition normalization and one-based narrator days align the authored acts.</w:t>
+        <w:t>The narrative layer also required alignment work. We normalized the profile condition names and passed one-based days to the authored arcs so that the programme begins in Act 1. We checked recommendation and closing rendering across the 70 main runs: 84,000 user-days produced 168,000 render calls with no recorded fallback. We also checked that skips do not create physical outcomes and that completion/Beta counts follow actual attempts.</w:t>
       </w:r>
     </w:p>
     <w:p>
@@ -3766,7 +3766,7 @@
           <w:rFonts w:ascii="Arial" w:hAnsi="Arial"/>
           <w:sz w:val="22"/>
         </w:rPr>
-        <w:t>Act defaults are doctor for days 1–15, coach for 16–40 and companion for 41–60; transition/emotional overrides can change the actual tone. A rendered message is not automatically clinically appropriate: benchmark cross-body choices and generic template rationale remain limitations. These are execution checks, not empathy or adherence measurements. Historical external LLM-judge scores are archived rather than reused as final-run evidence.</w:t>
+        <w:t>Default tone progresses from doctor (days 1–15) to coach (16–40) to companion (41–60), with transition and emotional overrides. These checks tell us the story mechanism runs, not whether the writing improves adherence. We leave that separate user-experience question open rather than reuse earlier LLM-judge scores for the revised experiments.</w:t>
       </w:r>
     </w:p>
     <w:p>
@@ -3787,7 +3787,7 @@
           <w:rFonts w:ascii="Arial" w:hAnsi="Arial"/>
           <w:sz w:val="22"/>
         </w:rPr>
-        <w:t>7. System demonstration and verification</w:t>
+        <w:t>7. Demonstration: interacting with the companion</w:t>
       </w:r>
     </w:p>
     <w:p>
@@ -3799,7 +3799,7 @@
           <w:rFonts w:ascii="Arial" w:hAnsi="Arial"/>
           <w:sz w:val="22"/>
         </w:rPr>
-        <w:t>7.1 Access and representative interaction</w:t>
+        <w:t>7.1 From recorded journey to live recommendation</w:t>
       </w:r>
     </w:p>
     <w:p>
@@ -3808,7 +3808,7 @@
           <w:rFonts w:ascii="Arial" w:hAnsi="Arial"/>
           <w:sz w:val="22"/>
         </w:rPr>
-        <w:t>After installing requirements.txt and optional requirements-agent.txt, securely set a compatible provider key, then run python -m narracare.agent_app --port 7860. The terminal equivalent is python -m narracare.agent --user U001 --seed 42. Default model is gpt-4o-mini; endpoint/model can be configured. The app binds locally, public sharing is disabled, and live chat requires network access. Only synthetic demo inputs should be sent.</w:t>
+        <w:t>The mountain-trail replay made the 60-day idea visible, but its buttons could not change a recorded recommendation. The Gradio agent makes that interaction real: a user checks in, changes a preference, asks why or supplies an outcome, and the tools act on the current session. Run python -m narracare.agent_app --port 7860 after installing both requirements files and configuring a provider key. The terminal alternative is python -m narracare.agent --user U001 --seed 42. Live chat uses gpt-4o-mini by default and needs network access.</w:t>
       </w:r>
     </w:p>
     <w:p>
@@ -3817,7 +3817,7 @@
           <w:rFonts w:ascii="Arial" w:hAnsi="Arial"/>
           <w:sz w:val="22"/>
         </w:rPr>
-        <w:t>The guided check-in can prepare “My current pain 3, fatigue 2, mood 7, ROM unknown. I prefer flexibility.” Send invokes LLM extraction and guarded retrieval. In the verified browser case, Safety reduced 100 to 61 candidates and retrieval produced ten relevant/preferred items; SAPS selected T017, IT Band Foam Rolling, difficulty 2/5, S=3.277. ROM remained unknown, with the conservative filtering proxy disclosed.</w:t>
+        <w:t>In our browser example, the user enters pain 3, fatigue 2, mood 7, unknown ROM and a flexibility preference. Safety reduces 100 candidates to 61, and retrieval narrows them to ten relevant/preferred items. SAPS selects T017, IT Band Foam Rolling, difficulty 2/5, S=3.277. The state panel and tool activity make this path visible alongside the companion message. Unknown ROM remains labelled, including the conservative proxy used for filtering.</w:t>
       </w:r>
     </w:p>
     <w:p>
@@ -3869,7 +3869,7 @@
           <w:rFonts w:ascii="Arial" w:hAnsi="Arial"/>
           <w:sz w:val="22"/>
         </w:rPr>
-        <w:t>Figure 1. Production Gradio agent: companion trail, a real task/counts and state panel. Progress is still zero before an outcome; this is not an embedded trajectory replay.</w:t>
+        <w:t>Figure 1. The live Gradio demo combines a companion trail with the recommended task, symptoms and tool activity. A recommendation alone does not award progress.</w:t>
       </w:r>
     </w:p>
     <w:p>
@@ -3878,7 +3878,7 @@
           <w:rFonts w:ascii="Arial" w:hAnsi="Arial"/>
           <w:sz w:val="22"/>
         </w:rPr>
-        <w:t>Users can ask why, revise a preference, decline, or report actual completion. “Completed. After pain 3, fatigue 3, satisfaction 0.8.” records the outcome and advances the day once. “I’ll try” does not. A fresh journey clears symptom fields; an explicit statement that pain prevents any task records a pause without invented recovery or learning.</w:t>
+        <w:t>The user can now ask for a different category or report “Completed. After pain 3, fatigue 3, satisfaction 0.8.” That outcome updates the session model and records the day. “I’ll try” requests feedback instructions instead of awarding completion. Skipping creates camp. We use these distinctions to give the trail meaning: progress reflects reported action, while rest remains an acceptable interaction rather than a fictional recovery event.</w:t>
       </w:r>
     </w:p>
     <w:p>
@@ -3890,7 +3890,7 @@
           <w:rFonts w:ascii="Arial" w:hAnsi="Arial"/>
           <w:sz w:val="22"/>
         </w:rPr>
-        <w:t>7.2 Offline integration and reproduction</w:t>
+        <w:t>7.2 How to verify the implemented system</w:t>
       </w:r>
     </w:p>
     <w:p>
@@ -3899,7 +3899,7 @@
           <w:rFonts w:ascii="Arial" w:hAnsi="Arial"/>
           <w:sz w:val="22"/>
         </w:rPr>
-        <w:t>Without a provider key, python -m narracare.demo --user U001 --days 60 --policy saps --seed 42 runs the five benchmark components and prints their actual order. --inspect reads source/config/data. --compare saps,linucb,neuralucb prints short live traces followed by separately labelled stored final benchmark means. All simulation outputs are isolated in temporary storage.</w:t>
+        <w:t>For an offline demonstration, run python -m narracare.demo --user U001 --days 60 --policy saps --seed 42. It executes the five benchmark components in temporary storage and prints their actual sequence. --inspect shows definitions; --compare saps,linucb,neuralucb shows short trajectories followed by separately labelled stored benchmark means. No API key is needed for this path.</w:t>
       </w:r>
     </w:p>
     <w:p>
@@ -3908,7 +3908,7 @@
           <w:rFonts w:ascii="Arial" w:hAnsi="Arial"/>
           <w:sz w:val="22"/>
         </w:rPr>
-        <w:t>python -m pytest -q verifies regression behavior; python -m narracare.agent_check explicitly uses the real provider. Eight provider smoke cases and a production-browser guided check-in/recommendation/feedback/reset/pain-pause sequence passed. These are engineering scenarios, not a representative user evaluation. bash scripts/reproduce_all.sh regenerates every cited suite and compares seven final artifacts, including all values, at rtol=1e-10 and atol=1e-12; it exits nonzero on mismatch and never overwrites the references.</w:t>
+        <w:t>We checked the live system with eight real-provider smoke cases and a browser sequence covering guided check-in, recommendation, actual feedback, reset and pain pause. Regression tests cover the underlying update rules. The teaching team can reproduce the experiment tables with bash scripts/reproduce_all.sh; README.md provides installation, demonstration and result-navigation instructions. These functional checks complement, but do not replace, evaluation with users.</w:t>
       </w:r>
     </w:p>
     <w:p>
@@ -3941,7 +3941,7 @@
           <w:rFonts w:ascii="Arial" w:hAnsi="Arial"/>
           <w:sz w:val="22"/>
         </w:rPr>
-        <w:t>8.1 What is useful and transferable</w:t>
+        <w:t>8.1 What we learned by building the complete loop</w:t>
       </w:r>
     </w:p>
     <w:p>
@@ -3950,7 +3950,7 @@
           <w:rFonts w:ascii="Arial" w:hAnsi="Arial"/>
           <w:sz w:val="22"/>
         </w:rPr>
-        <w:t>NarraCare shows how a context-aware recommender can expose its complete selection path: self-reported state and preferences constrain retrieval, a conventional learner ranks items, independent checks validate delivery, a template companion presents the result, and explicit outcomes drive learning. This organization can guide future work where unsafe recommendations have asymmetric cost, provided catalogue content, inputs and constraints receive appropriate domain validation.</w:t>
+        <w:t>Building NarraCare showed us why rehabilitation recommendation cannot be reduced to a ranking formula. Symptoms have to enter the system in a usable way, preferences must change the actual candidate set, and feedback must distinguish an intended action from an attempted one. The conversational extension and the skip correction addressed these integration problems, while the recommendation experiments exposed where the current learner remains weak.</w:t>
       </w:r>
     </w:p>
     <w:p>
@@ -3959,7 +3959,7 @@
           <w:rFonts w:ascii="Arial" w:hAnsi="Arial"/>
           <w:sz w:val="22"/>
         </w:rPr>
-        <w:t>The transferable contribution is an inspectable architecture and evaluation practice, rather than a clinically ready rehabilitation agent. Joint reporting of reward, acceptance/completion, proposal feasibility and executed-rule compliance makes tradeoffs visible. The safety ablation establishes an implementation mechanism; the fixed bonus ablation prevents attributing the mechanism’s benefit to an unsupported algorithmic claim.</w:t>
+        <w:t>Separating responsibilities was useful throughout this development. We could test a ranking bonus without changing the hard checks, revise feedback handling without inventing a new simulator, and replace recorded interaction with a live tool layer. The resulting contribution is a task-specific architecture combining recommendation, constraint enforcement, narrative presentation and feedback adaptation, together with experiments that make their different roles visible.</w:t>
       </w:r>
     </w:p>
     <w:p>
@@ -3971,7 +3971,7 @@
           <w:rFonts w:ascii="Arial" w:hAnsi="Arial"/>
           <w:sz w:val="22"/>
         </w:rPr>
-        <w:t>8.2 Why not simply use Random?</w:t>
+        <w:t>8.2 Practical value of the companion demo</w:t>
       </w:r>
     </w:p>
     <w:p>
@@ -3980,7 +3980,7 @@
           <w:rFonts w:ascii="Arial" w:hAnsi="Arial"/>
           <w:sz w:val="22"/>
         </w:rPr>
-        <w:t>Within this simulator, filtered Random is a strong baseline and has higher reward. There is no evidence-based reason here to claim SAPS should replace it on reward. SAPS produces fewer rule-infeasible raw proposals, but that diagnostic difference does not establish a better delivered outcome when all policies share the same filter. The appropriate conclusion is to retain the baseline and investigate assumptions, not to redefine success around a metric favorable to SAPS.</w:t>
+        <w:t>The demo gives a concrete way to discuss an otherwise abstract recommender. A user can see what was selected, why options were removed and how a preference revision changes retrieval. A developer or domain reviewer can follow the same interaction through the state panel. This could help evaluate the interaction design before any clinical deployment, using approved content in a future version.</w:t>
       </w:r>
     </w:p>
     <w:p>
@@ -3989,7 +3989,7 @@
           <w:rFonts w:ascii="Arial" w:hAnsi="Arial"/>
           <w:sz w:val="22"/>
         </w:rPr>
-        <w:t>The shortlist experiment shows that interface choice changes the simulated problem; coverage suggests a mechanism to investigate but not a cause already proven. The next useful improvement would specify an independent utility/validation target and controlled exploration experiment, rather than tuning tau on the final seeds until the table becomes favorable.</w:t>
+        <w:t>We designed the trail to make small actions feel like progress and to give rest a place in the experience. Changing from guidance toward companionship is intended to support autonomy instead of maintaining a demanding coach persona throughout rehabilitation. That is an application-design contribution and a testable user-experience hypothesis; the present reward simulator does not measure companionship, fatigue reduction or adherence gains.</w:t>
       </w:r>
     </w:p>
     <w:p>
@@ -4001,7 +4001,7 @@
           <w:rFonts w:ascii="Arial" w:hAnsi="Arial"/>
           <w:sz w:val="22"/>
         </w:rPr>
-        <w:t>8.3 Limitations and next steps</w:t>
+        <w:t>8.3 Remaining limitations and next steps</w:t>
       </w:r>
     </w:p>
     <w:p>
@@ -4010,7 +4010,7 @@
           <w:rFonts w:ascii="Arial" w:hAnsi="Arial"/>
           <w:sz w:val="22"/>
         </w:rPr>
-        <w:t>First, authored synthetic tasks and five predicates are not clinical ground truth. There is no clinician review, patient study or calibrated adverse-event label. The 51 design definitions must not be counted as fully enforced clinical rules. Real deployment would require approved exercise content, contraindication validation and monitored evaluation.</w:t>
+        <w:t>The first priority for real-world relevance is the content and its validation. Our synthetic tasks, dosage annotations and rule thresholds have no clinician sign-off or calibrated adverse-event labels. Zero SVR means the implemented predicates were satisfied in these runs. Before using the system with patients, exercises and contraindications would need clinical review, approved profile input and monitored evaluation.</w:t>
       </w:r>
     </w:p>
     <w:p>
@@ -4019,7 +4019,7 @@
           <w:rFonts w:ascii="Arial" w:hAnsi="Arial"/>
           <w:sz w:val="22"/>
         </w:rPr>
-        <w:t>Second, online results depend on the hand-designed utility, acceptance and recovery equations. Final seed separation tests stochastic repeatability within that environment, not independent real-world generalization. Shared learning, task-only Beta counts and weak baseline implementations limit what performance differences mean. The IER probe consumes randomness and changes training through penalties; it is not a completely external evaluator.</w:t>
+        <w:t>For recommendation research, filtered Random remains a strong result we need to explain rather than dismiss. More informative next steps are a controlled coverage intervention, better task/preference representations and an independently specified utility setting. The Beta signal currently pools users by task and does not decay. We should test changes on new validation conditions rather than tune against the final seeds until SAPS wins.</w:t>
       </w:r>
     </w:p>
     <w:p>
@@ -4028,7 +4028,7 @@
           <w:rFonts w:ascii="Arial" w:hAnsi="Arial"/>
           <w:sz w:val="22"/>
         </w:rPr>
-        <w:t>Third, the live and benchmark paths differ: real dialogue and category/body-part retrieval are present in the live agent, while the benchmark uses simulated outcomes and broader task eligibility. Engineering smoke tests do not establish conversational effectiveness. Missing input remains a practical challenge; guided entry is not medical-record ingestion, and unknown ROM handling needs clinical review.</w:t>
+        <w:t>The benchmark and live agent also answer different questions. The benchmark uses generated behavior and does not apply the live agent’s extra body-part/preference retrieval restriction, so it can recommend cross-body tasks. Repeated seeds assess variability within the same simulator, not clinical generalization. The live agent has guided self-report but no medical-record import, and unknown ROM handling still needs domain review.</w:t>
       </w:r>
     </w:p>
     <w:p>
@@ -4037,7 +4037,7 @@
           <w:rFonts w:ascii="Arial" w:hAnsi="Arial"/>
           <w:sz w:val="22"/>
         </w:rPr>
-        <w:t>Fourth, companionship, narrative tone and small trail achievements are intended to support autonomy and manageable effort. We have not shown improved adherence, reduced fatigue or therapeutic benefit. A controlled user study would be necessary before making those claims. Free-form LLM language, evidence extraction and keyword holds also remain fallible.</w:t>
+        <w:t>Finally, LLM extraction and keyword screening remain fallible, and engineering smoke cases do not establish conversational effectiveness. A future user study should assess whether people understand the recommendations, can comfortably report outcomes and experience the companion as supportive. This would connect our application design to the practical motivation more directly than additional simulated reward alone.</w:t>
       </w:r>
     </w:p>
     <w:p>
@@ -4058,7 +4058,7 @@
           <w:rFonts w:ascii="Arial" w:hAnsi="Arial"/>
           <w:sz w:val="22"/>
         </w:rPr>
-        <w:t>The final system is runnable, interactive and traceable to regenerated evidence. Hard runtime checks reduce recorded rule violations; SAPS does not establish reward or safety-bonus superiority, and filtered Random remains stronger on simulated utility. The project’s defensible contribution is a task-specific integration that makes these outcomes, limitations and future validation needs visible end to end.</w:t>
+        <w:t>We built NarraCare from a five-component sequential benchmark into a conversational recommender with a companion trail. The experiments clarified the effects of list size and runtime filtering, while showing no established gain from the present sampled bonus. The final system demonstrates how task selection, constraints and user feedback can work together; improving the ranking and validating the rehabilitation experience are the next steps.</w:t>
       </w:r>
     </w:p>
     <w:p>
@@ -4187,7 +4187,7 @@
           <w:rFonts w:ascii="Arial" w:hAnsi="Arial"/>
           <w:sz w:val="22"/>
         </w:rPr>
-        <w:t>Reproducibility note: evaluation/run_submission.py and evaluation/results/final/protocol.json define the exact final protocol and source/data hashes. Archived evidence is explicitly separated from current results. The report does not rely on historical LLM-judge scores as current evaluation.</w:t>
+        <w:t>Implementation, experiment settings and complete functional checks are available through the repository README and evaluation/README.md.</w:t>
       </w:r>
     </w:p>
     <w:p>

</xml_diff>